<commit_message>
4th Use-Case Question Added
</commit_message>
<xml_diff>
--- a/Use Case Questions.docx
+++ b/Use Case Questions.docx
@@ -116,40 +116,7 @@
           <w:sz w:val="22"/>
           <w:szCs w:val="22"/>
         </w:rPr>
-        <w:t>)</w:t>
-      </w:r>
-      <w:r>
-        <w:rPr>
-          <w:rFonts w:ascii="Comic Sans MS" w:hAnsi="Comic Sans MS"/>
-          <w:i/>
-          <w:iCs/>
-          <w:color w:val="000000"/>
-          <w:sz w:val="22"/>
-          <w:szCs w:val="22"/>
-        </w:rPr>
-        <w:t> </w:t>
-      </w:r>
-      <w:r>
-        <w:rPr>
-          <w:rFonts w:ascii="Comic Sans MS" w:hAnsi="Comic Sans MS"/>
-          <w:i/>
-          <w:iCs/>
-          <w:color w:val="000000"/>
-          <w:sz w:val="22"/>
-          <w:szCs w:val="22"/>
-        </w:rPr>
-        <w:t xml:space="preserve"> </w:t>
-      </w:r>
-      <w:r>
-        <w:rPr>
-          <w:rFonts w:ascii="Comic Sans MS" w:hAnsi="Comic Sans MS"/>
-          <w:i/>
-          <w:iCs/>
-          <w:color w:val="000000"/>
-          <w:sz w:val="22"/>
-          <w:szCs w:val="22"/>
-        </w:rPr>
-        <w:t>Create</w:t>
+        <w:t>)  Create</w:t>
       </w:r>
       <w:proofErr w:type="gramEnd"/>
       <w:r>
@@ -200,18 +167,7 @@
           <w:sz w:val="22"/>
           <w:szCs w:val="22"/>
         </w:rPr>
-        <w:t xml:space="preserve">)  </w:t>
-      </w:r>
-      <w:r>
-        <w:rPr>
-          <w:rFonts w:ascii="Comic Sans MS" w:hAnsi="Comic Sans MS"/>
-          <w:i/>
-          <w:iCs/>
-          <w:color w:val="000000"/>
-          <w:sz w:val="22"/>
-          <w:szCs w:val="22"/>
-        </w:rPr>
-        <w:t>Pass</w:t>
+        <w:t>)  Pass</w:t>
       </w:r>
       <w:proofErr w:type="gramEnd"/>
       <w:r>
@@ -314,6 +270,70 @@
           <w:shd w:val="clear" w:color="auto" w:fill="FFFFFF"/>
         </w:rPr>
         <w:t>Control Flow</w:t>
+      </w:r>
+    </w:p>
+    <w:p>
+      <w:pPr>
+        <w:pStyle w:val="ListParagraph"/>
+        <w:ind w:left="1440"/>
+        <w:rPr>
+          <w:rFonts w:ascii="Arial" w:hAnsi="Arial" w:cs="Arial"/>
+          <w:b/>
+          <w:bCs/>
+          <w:color w:val="000000"/>
+          <w:sz w:val="24"/>
+          <w:szCs w:val="24"/>
+          <w:u w:val="single"/>
+          <w:shd w:val="clear" w:color="auto" w:fill="FFFFFF"/>
+        </w:rPr>
+      </w:pPr>
+    </w:p>
+    <w:p>
+      <w:pPr>
+        <w:pStyle w:val="ListParagraph"/>
+        <w:numPr>
+          <w:ilvl w:val="0"/>
+          <w:numId w:val="2"/>
+        </w:numPr>
+        <w:rPr>
+          <w:rFonts w:ascii="Comic Sans MS" w:hAnsi="Comic Sans MS" w:cs="Arial"/>
+          <w:i/>
+          <w:iCs/>
+          <w:color w:val="000000"/>
+          <w:shd w:val="clear" w:color="auto" w:fill="FFFFFF"/>
+        </w:rPr>
+      </w:pPr>
+      <w:r>
+        <w:rPr>
+          <w:rFonts w:ascii="Comic Sans MS" w:hAnsi="Comic Sans MS"/>
+          <w:i/>
+          <w:iCs/>
+          <w:color w:val="000000"/>
+          <w:shd w:val="clear" w:color="auto" w:fill="FFFFFF"/>
+        </w:rPr>
+        <w:t xml:space="preserve">Use the Assign, For Each and If activities to find the minimum and maximum values in </w:t>
+      </w:r>
+      <w:proofErr w:type="gramStart"/>
+      <w:r>
+        <w:rPr>
+          <w:rFonts w:ascii="Comic Sans MS" w:hAnsi="Comic Sans MS"/>
+          <w:i/>
+          <w:iCs/>
+          <w:color w:val="000000"/>
+          <w:shd w:val="clear" w:color="auto" w:fill="FFFFFF"/>
+        </w:rPr>
+        <w:t>an</w:t>
+      </w:r>
+      <w:proofErr w:type="gramEnd"/>
+      <w:r>
+        <w:rPr>
+          <w:rFonts w:ascii="Comic Sans MS" w:hAnsi="Comic Sans MS"/>
+          <w:i/>
+          <w:iCs/>
+          <w:color w:val="000000"/>
+          <w:shd w:val="clear" w:color="auto" w:fill="FFFFFF"/>
+        </w:rPr>
+        <w:t xml:space="preserve"> pre-defined array and print the results to the Output panel.</w:t>
       </w:r>
     </w:p>
     <w:sectPr>

</xml_diff>